<commit_message>
feat: consolidate enterprise ATS v1 development
</commit_message>
<xml_diff>
--- a/assets/templates/offer-letter-v1.docx
+++ b/assets/templates/offer-letter-v1.docx
@@ -5721,13 +5721,57 @@
 </file>
 
 <file path=word/header1.xml><?xml version="1.0" encoding="utf-8"?>
-<w:hdr xmlns:wpc="http://schemas.microsoft.com/office/word/2010/wordprocessingCanvas" xmlns:cx="http://schemas.microsoft.com/office/drawing/2014/chartex" xmlns:cx1="http://schemas.microsoft.com/office/drawing/2015/9/8/chartex" xmlns:cx2="http://schemas.microsoft.com/office/drawing/2015/10/21/chartex" xmlns:cx3="http://schemas.microsoft.com/office/drawing/2016/5/9/chartex" xmlns:cx4="http://schemas.microsoft.com/office/drawing/2016/5/10/chartex" xmlns:cx5="http://schemas.microsoft.com/office/drawing/2016/5/11/chartex" xmlns:cx6="http://schemas.microsoft.com/office/drawing/2016/5/12/chartex" xmlns:cx7="http://schemas.microsoft.com/office/drawing/2016/5/13/chartex" xmlns:cx8="http://schemas.microsoft.com/office/drawing/2016/5/14/chartex" xmlns:mc="http://schemas.openxmlformats.org/markup-compatibility/2006" xmlns:aink="http://schemas.microsoft.com/office/drawing/2016/ink" xmlns:am3d="http://schemas.microsoft.com/office/drawing/2017/model3d" xmlns:o="urn:schemas-microsoft-com:office:office" xmlns:oel="http://schemas.microsoft.com/office/2019/extlst" xmlns:r="http://schemas.openxmlformats.org/officeDocument/2006/relationships" xmlns:m="http://schemas.openxmlformats.org/officeDocument/2006/math" xmlns:v="urn:schemas-microsoft-com:vml" xmlns:wp14="http://schemas.microsoft.com/office/word/2010/wordprocessingDrawing" xmlns:wp="http://schemas.openxmlformats.org/drawingml/2006/wordprocessingDrawing" xmlns:w10="urn:schemas-microsoft-com:office:word" xmlns:w="http://schemas.openxmlformats.org/wordprocessingml/2006/main" xmlns:w14="http://schemas.microsoft.com/office/word/2010/wordml" xmlns:w15="http://schemas.microsoft.com/office/word/2012/wordml" xmlns:w16cei="http://schemas.microsoft.com/office/word/2026/wordml/cei" xmlns:w16cex="http://schemas.microsoft.com/office/word/2018/wordml/cex" xmlns:w16cid="http://schemas.microsoft.com/office/word/2016/wordml/cid" xmlns:w16="http://schemas.microsoft.com/office/word/2018/wordml" xmlns:w16du="http://schemas.microsoft.com/office/word/2023/wordml/word16du" xmlns:w16sdtdh="http://schemas.microsoft.com/office/word/2020/wordml/sdtdatahash" xmlns:w16sdtfl="http://schemas.microsoft.com/office/word/2024/wordml/sdtformatlock" xmlns:w16se="http://schemas.microsoft.com/office/word/2015/wordml/symex" xmlns:wpg="http://schemas.microsoft.com/office/word/2010/wordprocessingGroup" xmlns:wpi="http://schemas.microsoft.com/office/word/2010/wordprocessingInk" xmlns:wne="http://schemas.microsoft.com/office/word/2006/wordml" xmlns:wps="http://schemas.microsoft.com/office/word/2010/wordprocessingShape" mc:Ignorable="w14 w15 w16se w16cid w16 w16cex w16sdtdh w16sdtfl w16du wp14">
+<w:hdr xmlns:wpc="http://schemas.microsoft.com/office/word/2010/wordprocessingCanvas" xmlns:mc="http://schemas.openxmlformats.org/markup-compatibility/2006" xmlns:r="http://schemas.openxmlformats.org/officeDocument/2006/relationships" xmlns:wp="http://schemas.openxmlformats.org/drawingml/2006/wordprocessingDrawing" xmlns:a="http://schemas.openxmlformats.org/drawingml/2006/main" xmlns:w="http://schemas.openxmlformats.org/wordprocessingml/2006/main" mc:Ignorable="w14 w15 wp14">
   <w:p>
     <w:pPr>
       <w:pStyle w:val="Header"/>
+      <w:spacing w:after="0" w:line="240" w:lineRule="auto"/>
     </w:pPr>
     <w:r>
-      <w:t xml:space="preserve"> </w:t>
+      <w:drawing>
+        <wp:inline distT="0" distB="0" distL="0" distR="0">
+          <wp:extent cx="571500" cy="462600"/>
+          <wp:effectExtent l="0" t="0" r="0" b="0"/>
+          <wp:docPr id="990001" name="Optalynx Logo" descr="Optalynx logo"/>
+          <wp:cNvGraphicFramePr>
+            <a:graphicFrameLocks noChangeAspect="1"/>
+          </wp:cNvGraphicFramePr>
+          <a:graphic>
+            <a:graphicData uri="http://schemas.openxmlformats.org/drawingml/2006/picture">
+              <pic:pic xmlns:pic="http://schemas.openxmlformats.org/drawingml/2006/picture">
+                <pic:nvPicPr>
+                  <pic:cNvPr id="990001" name="Optalynx Logo"/>
+                  <pic:cNvPicPr/>
+                </pic:nvPicPr>
+                <pic:blipFill>
+                  <a:blip r:embed="rId1"/>
+                  <a:stretch>
+                    <a:fillRect/>
+                  </a:stretch>
+                </pic:blipFill>
+                <pic:spPr>
+                  <a:xfrm>
+                    <a:off x="0" y="0"/>
+                    <a:ext cx="571500" cy="462600"/>
+                  </a:xfrm>
+                  <a:prstGeom prst="rect">
+                    <a:avLst/>
+                  </a:prstGeom>
+                </pic:spPr>
+              </pic:pic>
+            </a:graphicData>
+          </a:graphic>
+        </wp:inline>
+      </w:drawing>
+    </w:r>
+    <w:r>
+      <w:rPr>
+        <w:rFonts w:ascii="Arial" w:hAnsi="Arial"/>
+        <w:color w:val="1F3B63"/>
+        <w:sz w:val="18"/>
+        <w:szCs w:val="18"/>
+      </w:rPr>
+      <w:t xml:space="preserve">  Linking Talent with Opportunity</w:t>
     </w:r>
   </w:p>
 </w:hdr>

</xml_diff>